<commit_message>
Final version of config
</commit_message>
<xml_diff>
--- a/Отчет/Производственная практика. Отчёт. Дорогин Никита ИП-312.docx
+++ b/Отчет/Производственная практика. Отчёт. Дорогин Никита ИП-312.docx
@@ -7845,7 +7845,19 @@
         <w:rPr>
           <w:color w:val="181A17"/>
         </w:rPr>
-        <w:t>Формирование плана по количеству выпуска определённого вида деталей по участкам, бригадам, цехам</w:t>
+        <w:t xml:space="preserve">Формирование плана по количеству выпуска определённого вида </w:t>
+      </w:r>
+      <w:r>
+        <w:rPr>
+          <w:color w:val="181A17"/>
+        </w:rPr>
+        <w:t>товаров</w:t>
+      </w:r>
+      <w:r>
+        <w:rPr>
+          <w:color w:val="181A17"/>
+        </w:rPr>
+        <w:t xml:space="preserve"> по участкам, бригадам, цехам</w:t>
       </w:r>
     </w:p>
     <w:p>
@@ -7863,7 +7875,31 @@
         <w:rPr>
           <w:color w:val="181A17"/>
         </w:rPr>
-        <w:t>Фиксация информации о количестве деталей (произведенных, оплаченных, забракованных)</w:t>
+        <w:t xml:space="preserve">Фиксация информации о количестве </w:t>
+      </w:r>
+      <w:r>
+        <w:rPr>
+          <w:color w:val="181A17"/>
+        </w:rPr>
+        <w:t>товаров</w:t>
+      </w:r>
+      <w:r>
+        <w:rPr>
+          <w:color w:val="181A17"/>
+        </w:rPr>
+        <w:t xml:space="preserve"> (произведенных, </w:t>
+      </w:r>
+      <w:r>
+        <w:rPr>
+          <w:color w:val="181A17"/>
+        </w:rPr>
+        <w:t>выданных, принятых</w:t>
+      </w:r>
+      <w:r>
+        <w:rPr>
+          <w:color w:val="181A17"/>
+        </w:rPr>
+        <w:t>, забракованных)</w:t>
       </w:r>
     </w:p>
     <w:p>
@@ -7881,7 +7917,19 @@
         <w:rPr>
           <w:color w:val="181A17"/>
         </w:rPr>
-        <w:t>Получение информации по количеству деталей в разрезе бригад, цехов, участков</w:t>
+        <w:t xml:space="preserve">Получение информации по количеству </w:t>
+      </w:r>
+      <w:r>
+        <w:rPr>
+          <w:color w:val="181A17"/>
+        </w:rPr>
+        <w:t>товаров</w:t>
+      </w:r>
+      <w:r>
+        <w:rPr>
+          <w:color w:val="181A17"/>
+        </w:rPr>
+        <w:t xml:space="preserve"> в разрезе бригад, цехов, участков</w:t>
       </w:r>
     </w:p>
     <w:p>
@@ -7988,8 +8036,15 @@
         <w:rPr>
           <w:color w:val="181A17"/>
         </w:rPr>
-        <w:t>Отчет по себестоимости</w:t>
-      </w:r>
+        <w:t>Отчет по план-факту производства</w:t>
+      </w:r>
+    </w:p>
+    <w:p>
+      <w:pPr>
+        <w:rPr>
+          <w:color w:val="181A17"/>
+        </w:rPr>
+      </w:pPr>
     </w:p>
     <w:p>
       <w:pPr>
@@ -8006,15 +8061,8 @@
         <w:rPr>
           <w:color w:val="181A17"/>
         </w:rPr>
-        <w:t>Отчет по план-факту производства</w:t>
-      </w:r>
-    </w:p>
-    <w:p>
-      <w:pPr>
-        <w:rPr>
-          <w:color w:val="181A17"/>
-        </w:rPr>
-      </w:pPr>
+        <w:t>Номер рапорта</w:t>
+      </w:r>
     </w:p>
     <w:p>
       <w:pPr>
@@ -8031,7 +8079,7 @@
         <w:rPr>
           <w:color w:val="181A17"/>
         </w:rPr>
-        <w:t>Номер рапорта</w:t>
+        <w:t>Месяц</w:t>
       </w:r>
     </w:p>
     <w:p>
@@ -8049,7 +8097,7 @@
         <w:rPr>
           <w:color w:val="181A17"/>
         </w:rPr>
-        <w:t>Месяц</w:t>
+        <w:t>Год</w:t>
       </w:r>
     </w:p>
     <w:p>
@@ -8067,7 +8115,7 @@
         <w:rPr>
           <w:color w:val="181A17"/>
         </w:rPr>
-        <w:t>Год</w:t>
+        <w:t>Код цеха</w:t>
       </w:r>
     </w:p>
     <w:p>
@@ -8085,7 +8133,7 @@
         <w:rPr>
           <w:color w:val="181A17"/>
         </w:rPr>
-        <w:t>Код цеха</w:t>
+        <w:t>Название цеха</w:t>
       </w:r>
     </w:p>
     <w:p>
@@ -8103,7 +8151,7 @@
         <w:rPr>
           <w:color w:val="181A17"/>
         </w:rPr>
-        <w:t>Название цеха</w:t>
+        <w:t>Код участка</w:t>
       </w:r>
     </w:p>
     <w:p>
@@ -8121,7 +8169,7 @@
         <w:rPr>
           <w:color w:val="181A17"/>
         </w:rPr>
-        <w:t>Код участка</w:t>
+        <w:t>Название участка</w:t>
       </w:r>
     </w:p>
     <w:p>
@@ -8139,7 +8187,7 @@
         <w:rPr>
           <w:color w:val="181A17"/>
         </w:rPr>
-        <w:t>Название участка</w:t>
+        <w:t>Код бригады</w:t>
       </w:r>
     </w:p>
     <w:p>
@@ -8157,7 +8205,7 @@
         <w:rPr>
           <w:color w:val="181A17"/>
         </w:rPr>
-        <w:t>Код бригады</w:t>
+        <w:t>ФИО бригадира</w:t>
       </w:r>
     </w:p>
     <w:p>
@@ -8175,7 +8223,7 @@
         <w:rPr>
           <w:color w:val="181A17"/>
         </w:rPr>
-        <w:t>ФИО бригадира</w:t>
+        <w:t>Номер детали</w:t>
       </w:r>
     </w:p>
     <w:p>
@@ -8193,7 +8241,7 @@
         <w:rPr>
           <w:color w:val="181A17"/>
         </w:rPr>
-        <w:t>Вид оплаты</w:t>
+        <w:t>Дата</w:t>
       </w:r>
     </w:p>
     <w:p>
@@ -8211,7 +8259,7 @@
         <w:rPr>
           <w:color w:val="181A17"/>
         </w:rPr>
-        <w:t>Код производственных затрат</w:t>
+        <w:t>Количество деталей, выданных в работу</w:t>
       </w:r>
     </w:p>
     <w:p>
@@ -8229,7 +8277,7 @@
         <w:rPr>
           <w:color w:val="181A17"/>
         </w:rPr>
-        <w:t>Номер детали</w:t>
+        <w:t>Количество деталей, принятых, годных</w:t>
       </w:r>
     </w:p>
     <w:p>
@@ -8247,76 +8295,38 @@
         <w:rPr>
           <w:color w:val="181A17"/>
         </w:rPr>
-        <w:t>Дата</w:t>
-      </w:r>
-    </w:p>
-    <w:p>
-      <w:pPr>
-        <w:pStyle w:val="af4"/>
-        <w:numPr>
-          <w:ilvl w:val="0"/>
-          <w:numId w:val="1"/>
-        </w:numPr>
-        <w:rPr>
-          <w:color w:val="181A17"/>
-        </w:rPr>
-      </w:pPr>
-      <w:r>
-        <w:rPr>
-          <w:color w:val="181A17"/>
-        </w:rPr>
-        <w:t>Количество деталей, выданных в работу</w:t>
-      </w:r>
-    </w:p>
-    <w:p>
-      <w:pPr>
-        <w:pStyle w:val="af4"/>
-        <w:numPr>
-          <w:ilvl w:val="0"/>
-          <w:numId w:val="1"/>
-        </w:numPr>
-        <w:rPr>
-          <w:color w:val="181A17"/>
-        </w:rPr>
-      </w:pPr>
-      <w:r>
-        <w:rPr>
-          <w:color w:val="181A17"/>
-        </w:rPr>
-        <w:t>Количество деталей, принятых, годных</w:t>
-      </w:r>
-    </w:p>
-    <w:p>
-      <w:pPr>
-        <w:pStyle w:val="af4"/>
-        <w:numPr>
-          <w:ilvl w:val="0"/>
-          <w:numId w:val="1"/>
-        </w:numPr>
-        <w:rPr>
-          <w:color w:val="181A17"/>
-        </w:rPr>
-      </w:pPr>
-      <w:r>
-        <w:rPr>
-          <w:color w:val="181A17"/>
-        </w:rPr>
         <w:t>Количество деталей, бракованных</w:t>
       </w:r>
     </w:p>
     <w:p>
       <w:pPr>
-        <w:rPr>
-          <w:iCs/>
-          <w:color w:val="181A17"/>
-        </w:rPr>
-      </w:pPr>
-      <w:r>
-        <w:rPr>
-          <w:color w:val="181A17"/>
-        </w:rPr>
-        <w:t>Количество деталей, оплаченных</w:t>
-      </w:r>
+        <w:jc w:val="center"/>
+        <w:rPr>
+          <w:rFonts w:ascii="Times New Roman" w:hAnsi="Times New Roman"/>
+          <w:b/>
+          <w:color w:val="181A17"/>
+        </w:rPr>
+      </w:pPr>
+    </w:p>
+    <w:p>
+      <w:pPr>
+        <w:jc w:val="center"/>
+        <w:rPr>
+          <w:rFonts w:ascii="Times New Roman" w:hAnsi="Times New Roman"/>
+          <w:b/>
+          <w:color w:val="181A17"/>
+        </w:rPr>
+      </w:pPr>
+    </w:p>
+    <w:p>
+      <w:pPr>
+        <w:jc w:val="center"/>
+        <w:rPr>
+          <w:rFonts w:ascii="Times New Roman" w:hAnsi="Times New Roman"/>
+          <w:b/>
+          <w:color w:val="181A17"/>
+        </w:rPr>
+      </w:pPr>
     </w:p>
     <w:p>
       <w:pPr>
@@ -8398,6 +8408,7 @@
         </w:rPr>
         <w:t>Платформа «1</w:t>
       </w:r>
+      <w:proofErr w:type="gramStart"/>
       <w:r>
         <w:rPr>
           <w:b/>
@@ -8407,6 +8418,7 @@
         </w:rPr>
         <w:t>С:Предприятие</w:t>
       </w:r>
+      <w:proofErr w:type="gramEnd"/>
       <w:r>
         <w:rPr>
           <w:b/>
@@ -8441,7 +8453,23 @@
           <w:iCs/>
           <w:color w:val="181A17"/>
         </w:rPr>
-        <w:t>Технологическая платформа «1С:Предприятие 8» является основой для создания всех прикладных решений. Её ключевая особенность — метаданные: разработчик не пишет код с нуля, а визуально конструирует структуру будущего приложения, описывая справочники, документы, регистры и другие объекты. Платформа берёт на себя хранение данных, управление правами доступа, базовую бизнес-логику и построение интерфейсов. Это позволяет сосредоточиться на предметной задаче (учёте выработки), а не на низкоуровневой реализации. Система успешно применяется для автоматизации более чем 1 500 000 организаций, что подтверждает её надёжность и востребованность.</w:t>
+        <w:t>Технологическая платформа «1</w:t>
+      </w:r>
+      <w:proofErr w:type="gramStart"/>
+      <w:r>
+        <w:rPr>
+          <w:iCs/>
+          <w:color w:val="181A17"/>
+        </w:rPr>
+        <w:t>С:Предприятие</w:t>
+      </w:r>
+      <w:proofErr w:type="gramEnd"/>
+      <w:r>
+        <w:rPr>
+          <w:iCs/>
+          <w:color w:val="181A17"/>
+        </w:rPr>
+        <w:t xml:space="preserve"> 8» является основой для создания всех прикладных решений. Её ключевая особенность — метаданные: разработчик не пишет код с нуля, а визуально конструирует структуру будущего приложения, описывая справочники, документы, регистры и другие объекты. Платформа берёт на себя хранение данных, управление правами доступа, базовую бизнес-логику и построение интерфейсов. Это позволяет сосредоточиться на предметной задаче (учёте выработки), а не на низкоуровневой реализации. Система успешно применяется для автоматизации более чем 1 500 000 организаций, что подтверждает её надёжность и востребованность.</w:t>
       </w:r>
     </w:p>
     <w:p>
@@ -8689,7 +8717,39 @@
           <w:iCs/>
           <w:color w:val="181A17"/>
         </w:rPr>
-        <w:t>Наличие универсальных коллекций (Массив, Структура, ТаблицаЗначений, ДеревоЗначений) для удобной обработки данных в памяти.</w:t>
+        <w:t xml:space="preserve">Наличие универсальных коллекций (Массив, Структура, </w:t>
+      </w:r>
+      <w:proofErr w:type="spellStart"/>
+      <w:r>
+        <w:rPr>
+          <w:iCs/>
+          <w:color w:val="181A17"/>
+        </w:rPr>
+        <w:t>ТаблицаЗначений</w:t>
+      </w:r>
+      <w:proofErr w:type="spellEnd"/>
+      <w:r>
+        <w:rPr>
+          <w:iCs/>
+          <w:color w:val="181A17"/>
+        </w:rPr>
+        <w:t xml:space="preserve">, </w:t>
+      </w:r>
+      <w:proofErr w:type="spellStart"/>
+      <w:r>
+        <w:rPr>
+          <w:iCs/>
+          <w:color w:val="181A17"/>
+        </w:rPr>
+        <w:t>ДеревоЗначений</w:t>
+      </w:r>
+      <w:proofErr w:type="spellEnd"/>
+      <w:r>
+        <w:rPr>
+          <w:iCs/>
+          <w:color w:val="181A17"/>
+        </w:rPr>
+        <w:t>) для удобной обработки данных в памяти.</w:t>
       </w:r>
     </w:p>
     <w:p>
@@ -10084,12 +10144,12 @@
       </w:pPr>
     </w:p>
     <w:sectPr>
-      <w:headerReference w:type="even" r:id="rId8"/>
-      <w:headerReference w:type="default" r:id="rId9"/>
-      <w:footerReference w:type="even" r:id="rId10"/>
-      <w:footerReference w:type="default" r:id="rId11"/>
-      <w:headerReference w:type="first" r:id="rId12"/>
-      <w:footerReference w:type="first" r:id="rId13"/>
+      <w:headerReference w:type="even" r:id="rId9"/>
+      <w:headerReference w:type="default" r:id="rId10"/>
+      <w:footerReference w:type="even" r:id="rId11"/>
+      <w:footerReference w:type="default" r:id="rId12"/>
+      <w:headerReference w:type="first" r:id="rId13"/>
+      <w:footerReference w:type="first" r:id="rId14"/>
       <w:pgSz w:w="11906" w:h="16838"/>
       <w:pgMar w:top="1134" w:right="567" w:bottom="1134" w:left="1134" w:header="708" w:footer="708" w:gutter="0"/>
       <w:pgNumType w:start="1"/>
@@ -12180,10 +12240,22 @@
 </s:customData>
 </file>
 
+<file path=customXml/item2.xml><?xml version="1.0" encoding="utf-8"?>
+<b:Sources xmlns:b="http://schemas.openxmlformats.org/officeDocument/2006/bibliography" xmlns="http://schemas.openxmlformats.org/officeDocument/2006/bibliography" SelectedStyle="\APASixthEditionOfficeOnline.xsl" StyleName="APA" Version="6"/>
+</file>
+
 <file path=customXml/itemProps1.xml><?xml version="1.0" encoding="utf-8"?>
 <ds:datastoreItem xmlns:ds="http://schemas.openxmlformats.org/officeDocument/2006/customXml" ds:itemID="{B1977F7D-205B-4081-913C-38D41E755F92}">
   <ds:schemaRefs>
     <ds:schemaRef ds:uri="http://www.wps.cn/officeDocument/2013/wpsCustomData"/>
   </ds:schemaRefs>
 </ds:datastoreItem>
+</file>
+
+<file path=customXml/itemProps2.xml><?xml version="1.0" encoding="utf-8"?>
+<ds:datastoreItem xmlns:ds="http://schemas.openxmlformats.org/officeDocument/2006/customXml" ds:itemID="{40AEA6B4-6CDF-4844-95E5-05CE67DD5454}">
+  <ds:schemaRefs>
+    <ds:schemaRef ds:uri="http://schemas.openxmlformats.org/officeDocument/2006/bibliography"/>
+  </ds:schemaRefs>
+</ds:datastoreItem>
 </file>
</xml_diff>